<commit_message>
Docs - Update project documentation
+ Given Problem
+ Template
</commit_message>
<xml_diff>
--- a/Documents/Stages/Stages_template.docx
+++ b/Documents/Stages/Stages_template.docx
@@ -370,6 +370,7 @@
         <w:pStyle w:val="Heading1"/>
       </w:pPr>
       <w:r>
+        <w:lastRenderedPageBreak/>
         <w:t>2. Identify stakeholders</w:t>
       </w:r>
     </w:p>
@@ -655,6 +656,7 @@
         <w:pStyle w:val="Heading1"/>
       </w:pPr>
       <w:r>
+        <w:lastRenderedPageBreak/>
         <w:t>3. Plan requirement elicitation</w:t>
       </w:r>
     </w:p>
@@ -954,6 +956,7 @@
         <w:jc w:val="both"/>
       </w:pPr>
       <w:r>
+        <w:lastRenderedPageBreak/>
         <w:t>Membership purchase</w:t>
       </w:r>
     </w:p>
@@ -1250,6 +1253,7 @@
         <w:jc w:val="both"/>
       </w:pPr>
       <w:r>
+        <w:lastRenderedPageBreak/>
         <w:t>Current business rules</w:t>
       </w:r>
     </w:p>
@@ -1520,6 +1524,7 @@
         <w:jc w:val="both"/>
       </w:pPr>
       <w:r>
+        <w:lastRenderedPageBreak/>
         <w:t>Weak objective:</w:t>
       </w:r>
     </w:p>
@@ -1817,6 +1822,7 @@
         <w:jc w:val="both"/>
       </w:pPr>
       <w:r>
+        <w:lastRenderedPageBreak/>
         <w:t>MoMo QR integration</w:t>
       </w:r>
     </w:p>
@@ -2130,6 +2136,7 @@
         <w:jc w:val="both"/>
       </w:pPr>
       <w:r>
+        <w:lastRenderedPageBreak/>
         <w:t>Requirements should be separated into different types.</w:t>
       </w:r>
     </w:p>
@@ -2724,6 +2731,7 @@
         <w:jc w:val="both"/>
       </w:pPr>
       <w:r>
+        <w:lastRenderedPageBreak/>
         <w:t>Business value versus effort</w:t>
       </w:r>
     </w:p>
@@ -3035,6 +3043,7 @@
         <w:jc w:val="both"/>
       </w:pPr>
       <w:r>
+        <w:lastRenderedPageBreak/>
         <w:t>Design how the process should work after the system is introduced.</w:t>
       </w:r>
     </w:p>
@@ -3300,6 +3309,7 @@
         <w:jc w:val="both"/>
       </w:pPr>
       <w:r>
+        <w:lastRenderedPageBreak/>
         <w:t>Check out</w:t>
       </w:r>
     </w:p>
@@ -3609,6 +3619,7 @@
         <w:jc w:val="both"/>
       </w:pPr>
       <w:r>
+        <w:lastRenderedPageBreak/>
         <w:t>Identify:</w:t>
       </w:r>
     </w:p>
@@ -3949,6 +3960,7 @@
         <w:jc w:val="both"/>
       </w:pPr>
       <w:r>
+        <w:lastRenderedPageBreak/>
         <w:t>ERD</w:t>
       </w:r>
     </w:p>
@@ -3998,7 +4010,6 @@
         <w:pStyle w:val="Heading1"/>
       </w:pPr>
       <w:r>
-        <w:lastRenderedPageBreak/>
         <w:t>14. Define permissions and security</w:t>
       </w:r>
     </w:p>
@@ -4791,6 +4802,7 @@
         <w:pStyle w:val="Heading1"/>
       </w:pPr>
       <w:r>
+        <w:lastRenderedPageBreak/>
         <w:t>15. Create wireframes or prototypes</w:t>
       </w:r>
     </w:p>
@@ -5088,6 +5100,7 @@
         <w:jc w:val="both"/>
       </w:pPr>
       <w:r>
+        <w:lastRenderedPageBreak/>
         <w:t>Is this how the current process works?</w:t>
       </w:r>
     </w:p>
@@ -5357,6 +5370,7 @@
         <w:jc w:val="both"/>
       </w:pPr>
       <w:r>
+        <w:lastRenderedPageBreak/>
         <w:t>Epics</w:t>
       </w:r>
     </w:p>
@@ -5631,6 +5645,7 @@
         <w:pStyle w:val="Heading1"/>
       </w:pPr>
       <w:r>
+        <w:lastRenderedPageBreak/>
         <w:t>19. Support testing</w:t>
       </w:r>
     </w:p>
@@ -5916,6 +5931,7 @@
         <w:jc w:val="both"/>
       </w:pPr>
       <w:r>
+        <w:lastRenderedPageBreak/>
         <w:t>Maintenance staff</w:t>
       </w:r>
     </w:p>
@@ -6221,6 +6237,7 @@
         <w:jc w:val="both"/>
       </w:pPr>
       <w:r>
+        <w:lastRenderedPageBreak/>
         <w:t>User guide</w:t>
       </w:r>
     </w:p>

</xml_diff>